<commit_message>
J- E2E Coremind Prototype
</commit_message>
<xml_diff>
--- a/Apuntes/E2E/Contexto para DeepSearch/E2E_BPO_V3.docx
+++ b/Apuntes/E2E/Contexto para DeepSearch/E2E_BPO_V3.docx
@@ -7342,6 +7342,17 @@
       <w:r>
         <w:t xml:space="preserve">Informe de facturas/cobros/pagos pendientes: </w:t>
       </w:r>
+      <w:r>
+        <w:t>“</w:t>
+      </w:r>
+      <w:proofErr w:type="spellStart"/>
+      <w:r>
+        <w:t>fras</w:t>
+      </w:r>
+      <w:proofErr w:type="spellEnd"/>
+      <w:r>
+        <w:t xml:space="preserve"> pendientes”</w:t>
+      </w:r>
     </w:p>
     <w:p>
       <w:pPr>
@@ -7537,87 +7548,589 @@
       </w:r>
     </w:p>
     <w:p>
+      <w:r>
+        <w:t>Implica el cálculo y pago oportuno de impuestos (IVA, IRPF, sociedades), así como el cumplimiento de regulaciones financieras (</w:t>
+      </w:r>
+      <w:proofErr w:type="spellStart"/>
+      <w:r>
+        <w:t>e.g</w:t>
+      </w:r>
+      <w:proofErr w:type="spellEnd"/>
+      <w:r>
+        <w:t xml:space="preserve">., </w:t>
+      </w:r>
+      <w:proofErr w:type="spellStart"/>
+      <w:r>
+        <w:t>anti-lavado</w:t>
+      </w:r>
+      <w:proofErr w:type="spellEnd"/>
+      <w:r>
+        <w:t xml:space="preserve"> de dinero o </w:t>
+      </w:r>
+      <w:proofErr w:type="spellStart"/>
+      <w:r>
+        <w:t>reporting</w:t>
+      </w:r>
+      <w:proofErr w:type="spellEnd"/>
+      <w:r>
+        <w:t xml:space="preserve"> bajo IFRS). </w:t>
+      </w:r>
+    </w:p>
+    <w:p>
+      <w:r>
+        <w:t xml:space="preserve">En E2E, se vincula con procesos sensibles como el manejo de datos de clientes (de Soporte) o empleados (de RR.HH.), integrando con Legal para auditorías. </w:t>
+      </w:r>
+    </w:p>
+    <w:p>
+      <w:r>
+        <w:t>Ampliación: Incluye la preparación de declaraciones fiscales periódicas y la gestión de riesgos como multas por incumplimientos, con revisiones automáticas de transacciones para detectar anomalías (</w:t>
+      </w:r>
+      <w:proofErr w:type="spellStart"/>
+      <w:r>
+        <w:t>e.g</w:t>
+      </w:r>
+      <w:proofErr w:type="spellEnd"/>
+      <w:r>
+        <w:t xml:space="preserve">., facturas sin IVA aplicado correctamente). </w:t>
+      </w:r>
+    </w:p>
+    <w:p>
+      <w:r>
+        <w:t xml:space="preserve">Ejemplo: En un proceso E2E, una factura emitida en Finanzas se valida automáticamente contra normativas fiscales antes de enviarse a un cliente internacional, evitando errores que podrían propagarse a Operaciones. </w:t>
+      </w:r>
+    </w:p>
+    <w:p>
+      <w:r>
+        <w:t xml:space="preserve">Automatización E2E sugerida: </w:t>
+      </w:r>
+      <w:proofErr w:type="spellStart"/>
+      <w:r>
+        <w:t>Workflows</w:t>
+      </w:r>
+      <w:proofErr w:type="spellEnd"/>
+      <w:r>
+        <w:t xml:space="preserve"> en make.com que integran </w:t>
+      </w:r>
+      <w:proofErr w:type="spellStart"/>
+      <w:r>
+        <w:t>APIs</w:t>
+      </w:r>
+      <w:proofErr w:type="spellEnd"/>
+      <w:r>
+        <w:t xml:space="preserve"> de agencias tributarias (</w:t>
+      </w:r>
+      <w:proofErr w:type="spellStart"/>
+      <w:r>
+        <w:t>e.g</w:t>
+      </w:r>
+      <w:proofErr w:type="spellEnd"/>
+      <w:r>
+        <w:t>., Portal de la Agencia Tributaria) con el ERP, usando JavaScript para cálculos rápidos de impuestos y MCP para analizar documentos legales no estructurados (</w:t>
+      </w:r>
+      <w:proofErr w:type="spellStart"/>
+      <w:r>
+        <w:t>e.g</w:t>
+      </w:r>
+      <w:proofErr w:type="spellEnd"/>
+      <w:r>
+        <w:t>., clasificar riesgos en contratos). Esto fortalece la eliminación de barreras departamentales y la detección de tareas críticas manuales.</w:t>
+      </w:r>
+    </w:p>
+    <w:p/>
+    <w:p>
       <w:pPr>
         <w:pStyle w:val="Ttulo5"/>
       </w:pPr>
       <w:r>
+        <w:lastRenderedPageBreak/>
         <w:t>Tareas Más Frecuentes (Puntos de Automatización):</w:t>
       </w:r>
     </w:p>
     <w:p>
-      <w:pPr>
-        <w:pStyle w:val="Prrafodelista"/>
-        <w:numPr>
-          <w:ilvl w:val="0"/>
-          <w:numId w:val="17"/>
-        </w:numPr>
-      </w:pPr>
-      <w:r>
-        <w:rPr>
-          <w:b/>
-          <w:bCs/>
-        </w:rPr>
+      <w:r>
+        <w:t>En la filosofía E2E, estas tareas no se ven de forma aislada, sino como enlaces críticos en flujos transversales: por ejemplo, la facturación inicia en Ventas (captura de pedido) y cierra en Finanzas (cobro), pasando por Operaciones (entrega). El objetivo es identificar procesos manuales propensos a errores, como entradas de datos repetitivas o conciliaciones tardías, para optimizarlos mediante herramientas como n8n o make.com, que orquestan integraciones con sistemas como CRM, ERP y plataformas bancarias.</w:t>
+      </w:r>
+    </w:p>
+    <w:p/>
+    <w:p>
+      <w:pPr>
+        <w:pStyle w:val="Ttulo6"/>
+      </w:pPr>
+      <w:r>
         <w:t>Facturación a Clientes:</w:t>
       </w:r>
       <w:r>
-        <w:t xml:space="preserve"> Generar y emitir facturas (incluyendo cálculos tributarios) y enviarlas automáticamente.</w:t>
-      </w:r>
-    </w:p>
-    <w:p>
-      <w:pPr>
-        <w:pStyle w:val="Prrafodelista"/>
-        <w:numPr>
-          <w:ilvl w:val="0"/>
-          <w:numId w:val="17"/>
-        </w:numPr>
-      </w:pPr>
-      <w:r>
-        <w:rPr>
-          <w:b/>
-          <w:bCs/>
-        </w:rPr>
+        <w:t xml:space="preserve"> </w:t>
+      </w:r>
+    </w:p>
+    <w:p>
+      <w:r>
+        <w:t>Esta tarea implica la creación de facturas basadas en transacciones confirmadas (</w:t>
+      </w:r>
+      <w:proofErr w:type="spellStart"/>
+      <w:r>
+        <w:t>e.g</w:t>
+      </w:r>
+      <w:proofErr w:type="spellEnd"/>
+      <w:r>
+        <w:t xml:space="preserve">., ventas o servicios entregados), calculando automáticamente impuestos (IVA, retenciones) según normativas locales o internacionales, y distribuyéndolas vía email o portales digitales. </w:t>
+      </w:r>
+    </w:p>
+    <w:p>
+      <w:r>
+        <w:t>En E2E, cierra el ciclo de ingresos iniciado en Ventas (captura de lead) y validado en Operaciones (entrega), asegurando una transición fluida sin pérdidas de datos. Ampliación: Incluye la personalización de facturas (</w:t>
+      </w:r>
+      <w:proofErr w:type="spellStart"/>
+      <w:r>
+        <w:t>e.g</w:t>
+      </w:r>
+      <w:proofErr w:type="spellEnd"/>
+      <w:r>
+        <w:t>., adjuntar detalles de pedido o términos de pago), validación de datos (</w:t>
+      </w:r>
+      <w:proofErr w:type="spellStart"/>
+      <w:r>
+        <w:t>e.g</w:t>
+      </w:r>
+      <w:proofErr w:type="spellEnd"/>
+      <w:r>
+        <w:t xml:space="preserve">., direcciones fiscales) y seguimiento inicial de entrega. </w:t>
+      </w:r>
+    </w:p>
+    <w:p>
+      <w:r>
+        <w:t>Ejemplo: En una empresa de e-</w:t>
+      </w:r>
+      <w:proofErr w:type="spellStart"/>
+      <w:r>
+        <w:t>commerce</w:t>
+      </w:r>
+      <w:proofErr w:type="spellEnd"/>
+      <w:r>
+        <w:t>, una venta en el CRM (Ventas) activa la generación de factura en el ERP (Finanzas), incorporando descuentos de Marketing y verificando stock de Operaciones.</w:t>
+      </w:r>
+    </w:p>
+    <w:p>
+      <w:r>
+        <w:t xml:space="preserve">Impacto E2E: Retrasos aquí afectan el flujo de caja y la retención de clientes (Soporte). </w:t>
+      </w:r>
+    </w:p>
+    <w:p>
+      <w:r>
+        <w:t xml:space="preserve">Automatización E2E sugerida: Un </w:t>
+      </w:r>
+      <w:proofErr w:type="spellStart"/>
+      <w:r>
+        <w:t>workflow</w:t>
+      </w:r>
+      <w:proofErr w:type="spellEnd"/>
+      <w:r>
+        <w:t xml:space="preserve"> en n8n que se activa por un </w:t>
+      </w:r>
+      <w:proofErr w:type="spellStart"/>
+      <w:r>
+        <w:t>webhook</w:t>
+      </w:r>
+      <w:proofErr w:type="spellEnd"/>
+      <w:r>
+        <w:t xml:space="preserve"> del CRM (</w:t>
+      </w:r>
+      <w:proofErr w:type="spellStart"/>
+      <w:r>
+        <w:t>e.g</w:t>
+      </w:r>
+      <w:proofErr w:type="spellEnd"/>
+      <w:r>
+        <w:t xml:space="preserve">., estado "Entregado"), extrae datos, calcula impuestos con JavaScript (lógica </w:t>
+      </w:r>
+      <w:proofErr w:type="spellStart"/>
+      <w:r>
+        <w:t>inline</w:t>
+      </w:r>
+      <w:proofErr w:type="spellEnd"/>
+      <w:r>
+        <w:t xml:space="preserve"> para fórmulas simples), genera el PDF con plantillas (integrando herramientas como </w:t>
+      </w:r>
+      <w:proofErr w:type="spellStart"/>
+      <w:r>
+        <w:t>DocuSign</w:t>
+      </w:r>
+      <w:proofErr w:type="spellEnd"/>
+      <w:r>
+        <w:t xml:space="preserve">) y envía por email </w:t>
+      </w:r>
+      <w:proofErr w:type="spellStart"/>
+      <w:r>
+        <w:t>via</w:t>
+      </w:r>
+      <w:proofErr w:type="spellEnd"/>
+      <w:r>
+        <w:t xml:space="preserve"> API de Gmail/Outlook. Para cálculos complejos, usar Python en un nodo de código para manejar variaciones tributarias (</w:t>
+      </w:r>
+      <w:proofErr w:type="spellStart"/>
+      <w:r>
+        <w:t>e.g</w:t>
+      </w:r>
+      <w:proofErr w:type="spellEnd"/>
+      <w:r>
+        <w:t xml:space="preserve">., </w:t>
+      </w:r>
+      <w:proofErr w:type="spellStart"/>
+      <w:r>
+        <w:t>multijurisdiccionales</w:t>
+      </w:r>
+      <w:proofErr w:type="spellEnd"/>
+      <w:r>
+        <w:t>). Esto mitiga dolores como "Retrasos en el Flujo de Caja" y asegura cumplimiento (</w:t>
+      </w:r>
+      <w:proofErr w:type="spellStart"/>
+      <w:r>
+        <w:t>e.g</w:t>
+      </w:r>
+      <w:proofErr w:type="spellEnd"/>
+      <w:r>
+        <w:t xml:space="preserve">., RGPD en datos de clientes). </w:t>
+      </w:r>
+    </w:p>
+    <w:p>
+      <w:pPr>
+        <w:pStyle w:val="Ttulo6"/>
+      </w:pPr>
+      <w:r>
         <w:t>Cuentas por Cobrar (Cobros):</w:t>
       </w:r>
       <w:r>
-        <w:t xml:space="preserve"> Enviar recordatorios de pago y conciliar automáticamente los pagos bancarios con las facturas pendientes.</w:t>
-      </w:r>
-    </w:p>
-    <w:p>
-      <w:pPr>
-        <w:pStyle w:val="Prrafodelista"/>
-        <w:numPr>
-          <w:ilvl w:val="0"/>
-          <w:numId w:val="17"/>
-        </w:numPr>
-      </w:pPr>
-      <w:r>
-        <w:rPr>
-          <w:b/>
-          <w:bCs/>
-        </w:rPr>
+        <w:t xml:space="preserve"> </w:t>
+      </w:r>
+    </w:p>
+    <w:p>
+      <w:r>
+        <w:t>Enviar recordatorios de pago y conciliar automáticamente los pagos bancarios con las facturas pendientes.</w:t>
+      </w:r>
+    </w:p>
+    <w:p>
+      <w:r>
+        <w:t>Consiste en monitorear facturas vencidas, enviar notificaciones escalonadas (</w:t>
+      </w:r>
+      <w:proofErr w:type="spellStart"/>
+      <w:r>
+        <w:t>e.g</w:t>
+      </w:r>
+      <w:proofErr w:type="spellEnd"/>
+      <w:r>
+        <w:t>., recordatorios amigables a 15 días, formales a 30) y reconciliar pagos recibidos (</w:t>
+      </w:r>
+      <w:proofErr w:type="spellStart"/>
+      <w:r>
+        <w:t>e.g</w:t>
+      </w:r>
+      <w:proofErr w:type="spellEnd"/>
+      <w:r>
+        <w:t xml:space="preserve">., transferencias bancarias) con registros contables, actualizando saldos en tiempo real. </w:t>
+      </w:r>
+    </w:p>
+    <w:p>
+      <w:r>
+        <w:lastRenderedPageBreak/>
+        <w:t xml:space="preserve">En E2E, se integra con Ventas (historial de cliente) y TI (acceso a </w:t>
+      </w:r>
+      <w:proofErr w:type="spellStart"/>
+      <w:r>
+        <w:t>APIs</w:t>
+      </w:r>
+      <w:proofErr w:type="spellEnd"/>
+      <w:r>
+        <w:t xml:space="preserve"> bancarias), cerrando el </w:t>
+      </w:r>
+      <w:proofErr w:type="spellStart"/>
+      <w:r>
+        <w:t>loop</w:t>
+      </w:r>
+      <w:proofErr w:type="spellEnd"/>
+      <w:r>
+        <w:t xml:space="preserve"> de ingresos y detectando patrones de morosidad para retroalimentar a Marketing. </w:t>
+      </w:r>
+    </w:p>
+    <w:p>
+      <w:r>
+        <w:t xml:space="preserve">Ampliación: Incluye el análisis de </w:t>
+      </w:r>
+      <w:proofErr w:type="spellStart"/>
+      <w:r>
+        <w:t>aging</w:t>
+      </w:r>
+      <w:proofErr w:type="spellEnd"/>
+      <w:r>
+        <w:t xml:space="preserve"> </w:t>
+      </w:r>
+      <w:proofErr w:type="spellStart"/>
+      <w:r>
+        <w:t>reports</w:t>
+      </w:r>
+      <w:proofErr w:type="spellEnd"/>
+      <w:r>
+        <w:t xml:space="preserve"> (edad de deudas) y la aplicación de penalizaciones automáticas. Ejemplo: En un servicio B2B, un pago bancario detectado se concilia con una factura pendiente, notificando a Ventas si el cliente es recurrente para ofertas de </w:t>
+      </w:r>
+      <w:proofErr w:type="spellStart"/>
+      <w:r>
+        <w:t>upsell</w:t>
+      </w:r>
+      <w:proofErr w:type="spellEnd"/>
+      <w:r>
+        <w:t xml:space="preserve">. </w:t>
+      </w:r>
+    </w:p>
+    <w:p>
+      <w:r>
+        <w:t xml:space="preserve">Impacto E2E: Errores manuales aquí generan discrepancias en informes financieros y afectan la liquidez. </w:t>
+      </w:r>
+    </w:p>
+    <w:p>
+      <w:r>
+        <w:t xml:space="preserve">Automatización E2E sugerida: Flujos en make.com que consultan </w:t>
+      </w:r>
+      <w:proofErr w:type="spellStart"/>
+      <w:r>
+        <w:t>APIs</w:t>
+      </w:r>
+      <w:proofErr w:type="spellEnd"/>
+      <w:r>
+        <w:t xml:space="preserve"> bancarias (</w:t>
+      </w:r>
+      <w:proofErr w:type="spellStart"/>
+      <w:r>
+        <w:t>e.g</w:t>
+      </w:r>
+      <w:proofErr w:type="spellEnd"/>
+      <w:r>
+        <w:t xml:space="preserve">., Microsoft </w:t>
+      </w:r>
+      <w:proofErr w:type="spellStart"/>
+      <w:r>
+        <w:t>Graph</w:t>
+      </w:r>
+      <w:proofErr w:type="spellEnd"/>
+      <w:r>
+        <w:t xml:space="preserve"> para extractos) periódicamente, usan lógica condicional para enviar recordatorios escalonados vía email/SMS (integrando con </w:t>
+      </w:r>
+      <w:proofErr w:type="spellStart"/>
+      <w:r>
+        <w:t>Twilio</w:t>
+      </w:r>
+      <w:proofErr w:type="spellEnd"/>
+      <w:r>
+        <w:t>), y concilian con el software contable (</w:t>
+      </w:r>
+      <w:proofErr w:type="spellStart"/>
+      <w:r>
+        <w:t>e.g</w:t>
+      </w:r>
+      <w:proofErr w:type="spellEnd"/>
+      <w:r>
+        <w:t xml:space="preserve">., </w:t>
+      </w:r>
+      <w:proofErr w:type="spellStart"/>
+      <w:r>
+        <w:t>QuickBooks</w:t>
+      </w:r>
+      <w:proofErr w:type="spellEnd"/>
+      <w:r>
+        <w:t xml:space="preserve"> API). Para </w:t>
+      </w:r>
+      <w:proofErr w:type="spellStart"/>
+      <w:r>
+        <w:t>matching</w:t>
+      </w:r>
+      <w:proofErr w:type="spellEnd"/>
+      <w:r>
+        <w:t xml:space="preserve"> inteligente de pagos (</w:t>
+      </w:r>
+      <w:proofErr w:type="spellStart"/>
+      <w:r>
+        <w:t>e.g</w:t>
+      </w:r>
+      <w:proofErr w:type="spellEnd"/>
+      <w:r>
+        <w:t>., con variaciones en referencias), incorporar MCP para analizar descripciones de transacciones no estructuradas (</w:t>
+      </w:r>
+      <w:proofErr w:type="spellStart"/>
+      <w:r>
+        <w:t>e.g</w:t>
+      </w:r>
+      <w:proofErr w:type="spellEnd"/>
+      <w:r>
+        <w:t>., "Pago factura #123 - Cliente XYZ"). Python puede manejar scripts de conciliación compleja, reduciendo dolores como "Conciliación Bancaria Manual" y mejorando la eficiencia en cierres mensuales.</w:t>
+      </w:r>
+    </w:p>
+    <w:p/>
+    <w:p>
+      <w:pPr>
+        <w:pStyle w:val="Ttulo6"/>
+      </w:pPr>
+      <w:r>
         <w:t xml:space="preserve">Cuentas por Pagar (Pagos): </w:t>
       </w:r>
+    </w:p>
+    <w:p>
       <w:r>
         <w:t>Procesar facturas de proveedores y programar pagos.</w:t>
       </w:r>
     </w:p>
     <w:p>
-      <w:pPr>
-        <w:pStyle w:val="Prrafodelista"/>
-        <w:numPr>
-          <w:ilvl w:val="0"/>
-          <w:numId w:val="17"/>
-        </w:numPr>
-      </w:pPr>
-      <w:r>
-        <w:rPr>
-          <w:b/>
-          <w:bCs/>
-        </w:rPr>
+      <w:r>
+        <w:t>Esta tarea abarca la recepción y validación de facturas de proveedores (</w:t>
+      </w:r>
+      <w:proofErr w:type="spellStart"/>
+      <w:r>
+        <w:t>e.g</w:t>
+      </w:r>
+      <w:proofErr w:type="spellEnd"/>
+      <w:r>
+        <w:t>., verificación de montos y servicios recibidos), aprobación multietapa y programación de pagos (</w:t>
+      </w:r>
+      <w:proofErr w:type="spellStart"/>
+      <w:r>
+        <w:t>e.g</w:t>
+      </w:r>
+      <w:proofErr w:type="spellEnd"/>
+      <w:r>
+        <w:t>., vía transferencia o cheques), asegurando descuentos por pronto pago. En E2E, se vincula con Operaciones (confirmación de recepción de bienes) y Administración (aprobación de compras), optimizando la cadena de suministro sin interrupciones.</w:t>
+      </w:r>
+    </w:p>
+    <w:p>
+      <w:r>
+        <w:rPr>
+          <w:b/>
+          <w:bCs/>
+        </w:rPr>
+        <w:t>Ampliación:</w:t>
+      </w:r>
+      <w:r>
+        <w:t xml:space="preserve"> Incluye OCR para extracción de datos de facturas escaneadas y flujos de aprobación basados en umbrales (</w:t>
+      </w:r>
+      <w:proofErr w:type="spellStart"/>
+      <w:r>
+        <w:t>e.g</w:t>
+      </w:r>
+      <w:proofErr w:type="spellEnd"/>
+      <w:r>
+        <w:t xml:space="preserve">., &lt;5.000€ </w:t>
+      </w:r>
+      <w:proofErr w:type="spellStart"/>
+      <w:r>
+        <w:t>auto-aprobado</w:t>
+      </w:r>
+      <w:proofErr w:type="spellEnd"/>
+      <w:r>
+        <w:t xml:space="preserve">). Ejemplo: Una factura de materia prima (de Logística) se procesa en Finanzas, validando contra el presupuesto y programando pago para maximizar liquidez. </w:t>
+      </w:r>
+    </w:p>
+    <w:p>
+      <w:r>
+        <w:rPr>
+          <w:b/>
+          <w:bCs/>
+        </w:rPr>
+        <w:t>Impacto E2E:</w:t>
+      </w:r>
+      <w:r>
+        <w:t xml:space="preserve"> Retrasos afectan relaciones con proveedores y producción en Operaciones. </w:t>
+      </w:r>
+    </w:p>
+    <w:p>
+      <w:r>
+        <w:rPr>
+          <w:b/>
+          <w:bCs/>
+        </w:rPr>
+        <w:t>Automatización E2E sugerida:</w:t>
+      </w:r>
+      <w:r>
+        <w:t xml:space="preserve"> </w:t>
+      </w:r>
+      <w:proofErr w:type="spellStart"/>
+      <w:r>
+        <w:t>Workflows</w:t>
+      </w:r>
+      <w:proofErr w:type="spellEnd"/>
+      <w:r>
+        <w:t xml:space="preserve"> en n8n que monitorizan buzones de email para facturas entrantes, usan servicios OCR (</w:t>
+      </w:r>
+      <w:proofErr w:type="spellStart"/>
+      <w:r>
+        <w:t>e.g</w:t>
+      </w:r>
+      <w:proofErr w:type="spellEnd"/>
+      <w:r>
+        <w:t xml:space="preserve">., integrados </w:t>
+      </w:r>
+      <w:proofErr w:type="spellStart"/>
+      <w:r>
+        <w:t>via</w:t>
+      </w:r>
+      <w:proofErr w:type="spellEnd"/>
+      <w:r>
+        <w:t xml:space="preserve"> API como Google </w:t>
+      </w:r>
+      <w:proofErr w:type="spellStart"/>
+      <w:r>
+        <w:t>Vision</w:t>
+      </w:r>
+      <w:proofErr w:type="spellEnd"/>
+      <w:r>
+        <w:t xml:space="preserve">), validan datos con Python (scripts para chequeos de duplicados o anomalías), y enrutan aprobaciones vía </w:t>
+      </w:r>
+      <w:proofErr w:type="spellStart"/>
+      <w:r>
+        <w:t>Slack</w:t>
+      </w:r>
+      <w:proofErr w:type="spellEnd"/>
+      <w:r>
+        <w:t>/</w:t>
+      </w:r>
+      <w:proofErr w:type="spellStart"/>
+      <w:r>
+        <w:t>Teams</w:t>
+      </w:r>
+      <w:proofErr w:type="spellEnd"/>
+      <w:r>
+        <w:t xml:space="preserve">. Para programación inteligente, DAX en </w:t>
+      </w:r>
+      <w:proofErr w:type="spellStart"/>
+      <w:r>
+        <w:t>Power</w:t>
+      </w:r>
+      <w:proofErr w:type="spellEnd"/>
+      <w:r>
+        <w:t xml:space="preserve"> BI puede analizar impacto en cash </w:t>
+      </w:r>
+      <w:proofErr w:type="spellStart"/>
+      <w:r>
+        <w:t>flow</w:t>
+      </w:r>
+      <w:proofErr w:type="spellEnd"/>
+      <w:r>
+        <w:t xml:space="preserve"> antes de confirmar. Esto aborda dolores como </w:t>
+      </w:r>
+      <w:r>
+        <w:lastRenderedPageBreak/>
+        <w:t>"Procesamiento de Facturas de Proveedores (AP)" y elimina errores manuales, fomentando sincronización E2E con Legal para cumplimiento.</w:t>
+      </w:r>
+    </w:p>
+    <w:p>
+      <w:pPr>
+        <w:pStyle w:val="Ttulo6"/>
+      </w:pPr>
+      <w:r>
         <w:t>Generación de Asientos Contables:</w:t>
       </w:r>
       <w:r>
-        <w:t xml:space="preserve"> Registrar transacciones automáticamente en los libros contables (ej. ingresos por ventas).</w:t>
+        <w:t xml:space="preserve"> </w:t>
+      </w:r>
+    </w:p>
+    <w:p>
+      <w:r>
+        <w:t>Registrar transacciones automáticamente en los libros contables (ej. ingresos por ventas).</w:t>
       </w:r>
     </w:p>
     <w:p/>
@@ -8195,235 +8708,235 @@
         </w:numPr>
       </w:pPr>
       <w:r>
+        <w:t>Hojas de Cálculo Avanzadas: Microsoft Excel (para modelado y proyecciones).</w:t>
+      </w:r>
+    </w:p>
+    <w:p>
+      <w:pPr>
+        <w:pStyle w:val="Prrafodelista"/>
+        <w:numPr>
+          <w:ilvl w:val="0"/>
+          <w:numId w:val="17"/>
+        </w:numPr>
+      </w:pPr>
+      <w:r>
+        <w:t>Portal de la Agencia Tributaria / Sistemas de Declaración Fiscal.</w:t>
+      </w:r>
+    </w:p>
+    <w:p>
+      <w:pPr>
+        <w:rPr>
+          <w:b/>
+          <w:bCs/>
+        </w:rPr>
+      </w:pPr>
+      <w:r>
+        <w:rPr>
+          <w:b/>
+          <w:bCs/>
+        </w:rPr>
+        <w:t>Herramientas Comunes y Necesarias (Automatización E2E)</w:t>
+      </w:r>
+    </w:p>
+    <w:p>
+      <w:pPr>
+        <w:pStyle w:val="Prrafodelista"/>
+        <w:numPr>
+          <w:ilvl w:val="0"/>
+          <w:numId w:val="17"/>
+        </w:numPr>
+      </w:pPr>
+      <w:r>
+        <w:t>Sistemas de Gestión de Cuentas por Pagar (AP) / Cobrar (AR).</w:t>
+      </w:r>
+    </w:p>
+    <w:p>
+      <w:pPr>
+        <w:pStyle w:val="Prrafodelista"/>
+        <w:numPr>
+          <w:ilvl w:val="0"/>
+          <w:numId w:val="17"/>
+        </w:numPr>
+      </w:pPr>
+      <w:r>
+        <w:t>Plataformas de Conciliación Bancaria Automática.</w:t>
+      </w:r>
+    </w:p>
+    <w:p>
+      <w:pPr>
+        <w:pStyle w:val="Prrafodelista"/>
+        <w:numPr>
+          <w:ilvl w:val="0"/>
+          <w:numId w:val="17"/>
+        </w:numPr>
+      </w:pPr>
+      <w:r>
+        <w:t xml:space="preserve">Herramientas de Automatización de Gastos: SAP </w:t>
+      </w:r>
+      <w:proofErr w:type="spellStart"/>
+      <w:r>
+        <w:t>Concur</w:t>
+      </w:r>
+      <w:proofErr w:type="spellEnd"/>
+      <w:r>
+        <w:t xml:space="preserve">, </w:t>
+      </w:r>
+      <w:proofErr w:type="spellStart"/>
+      <w:r>
+        <w:t>Expensify</w:t>
+      </w:r>
+      <w:proofErr w:type="spellEnd"/>
+      <w:r>
+        <w:t>.</w:t>
+      </w:r>
+    </w:p>
+    <w:p>
+      <w:pPr>
+        <w:pStyle w:val="Prrafodelista"/>
+        <w:numPr>
+          <w:ilvl w:val="0"/>
+          <w:numId w:val="17"/>
+        </w:numPr>
+      </w:pPr>
+      <w:r>
+        <w:t>Software de Tesorería y Gestión del Flujo de Caja.</w:t>
+      </w:r>
+    </w:p>
+    <w:p/>
+    <w:p>
+      <w:pPr>
+        <w:pStyle w:val="Ttulo4"/>
+        <w:rPr>
+          <w:b/>
+          <w:bCs/>
+        </w:rPr>
+      </w:pPr>
+      <w:r>
+        <w:t>Esquema Documentación Herramientas</w:t>
+      </w:r>
+    </w:p>
+    <w:p>
+      <w:r>
+        <w:t>Herramienta Clave:</w:t>
+      </w:r>
+    </w:p>
+    <w:p>
+      <w:pPr>
+        <w:pStyle w:val="Prrafodelista"/>
+        <w:numPr>
+          <w:ilvl w:val="0"/>
+          <w:numId w:val="17"/>
+        </w:numPr>
+      </w:pPr>
+      <w:r>
+        <w:t>Tipo de Documentación Imprescindible</w:t>
+      </w:r>
+      <w:r>
+        <w:tab/>
+      </w:r>
+    </w:p>
+    <w:p>
+      <w:pPr>
+        <w:pStyle w:val="Prrafodelista"/>
+        <w:numPr>
+          <w:ilvl w:val="0"/>
+          <w:numId w:val="17"/>
+        </w:numPr>
+      </w:pPr>
+      <w:r>
+        <w:t>Tipo de Documentación Necesaria (E2E/Automatización)</w:t>
+      </w:r>
+    </w:p>
+    <w:p>
+      <w:pPr>
+        <w:rPr>
+          <w:b/>
+          <w:bCs/>
+        </w:rPr>
+      </w:pPr>
+      <w:r>
+        <w:rPr>
+          <w:b/>
+          <w:bCs/>
+        </w:rPr>
+        <w:t>Software de Contabilidad (</w:t>
+      </w:r>
+      <w:proofErr w:type="spellStart"/>
+      <w:r>
+        <w:rPr>
+          <w:b/>
+          <w:bCs/>
+        </w:rPr>
+        <w:t>QuickBooks</w:t>
+      </w:r>
+      <w:proofErr w:type="spellEnd"/>
+      <w:r>
+        <w:rPr>
+          <w:b/>
+          <w:bCs/>
+        </w:rPr>
+        <w:t>, Sage)</w:t>
+      </w:r>
+    </w:p>
+    <w:p>
+      <w:pPr>
+        <w:pStyle w:val="Prrafodelista"/>
+        <w:numPr>
+          <w:ilvl w:val="0"/>
+          <w:numId w:val="17"/>
+        </w:numPr>
+      </w:pPr>
+      <w:r>
+        <w:t>Manuales de Registro de Asientos Contables y Cierre Fiscal.</w:t>
+      </w:r>
+      <w:r>
+        <w:tab/>
+      </w:r>
+    </w:p>
+    <w:p>
+      <w:pPr>
+        <w:pStyle w:val="Prrafodelista"/>
+        <w:numPr>
+          <w:ilvl w:val="0"/>
+          <w:numId w:val="17"/>
+        </w:numPr>
+      </w:pPr>
+      <w:r>
+        <w:t>Documentación de la API de Contabilidad para la inserción automática de facturas y asientos.</w:t>
+      </w:r>
+    </w:p>
+    <w:p>
+      <w:pPr>
+        <w:rPr>
+          <w:b/>
+          <w:bCs/>
+        </w:rPr>
+      </w:pPr>
+      <w:r>
+        <w:rPr>
+          <w:b/>
+          <w:bCs/>
+        </w:rPr>
+        <w:t>ERP/Módulos Financieros</w:t>
+      </w:r>
+      <w:r>
+        <w:rPr>
+          <w:b/>
+          <w:bCs/>
+        </w:rPr>
+        <w:tab/>
+      </w:r>
+    </w:p>
+    <w:p>
+      <w:pPr>
+        <w:pStyle w:val="Prrafodelista"/>
+        <w:numPr>
+          <w:ilvl w:val="0"/>
+          <w:numId w:val="17"/>
+        </w:numPr>
+      </w:pPr>
+      <w:r>
         <w:lastRenderedPageBreak/>
-        <w:t>Hojas de Cálculo Avanzadas: Microsoft Excel (para modelado y proyecciones).</w:t>
-      </w:r>
-    </w:p>
-    <w:p>
-      <w:pPr>
-        <w:pStyle w:val="Prrafodelista"/>
-        <w:numPr>
-          <w:ilvl w:val="0"/>
-          <w:numId w:val="17"/>
-        </w:numPr>
-      </w:pPr>
-      <w:r>
-        <w:t>Portal de la Agencia Tributaria / Sistemas de Declaración Fiscal.</w:t>
-      </w:r>
-    </w:p>
-    <w:p>
-      <w:pPr>
-        <w:rPr>
-          <w:b/>
-          <w:bCs/>
-        </w:rPr>
-      </w:pPr>
-      <w:r>
-        <w:rPr>
-          <w:b/>
-          <w:bCs/>
-        </w:rPr>
-        <w:t>Herramientas Comunes y Necesarias (Automatización E2E)</w:t>
-      </w:r>
-    </w:p>
-    <w:p>
-      <w:pPr>
-        <w:pStyle w:val="Prrafodelista"/>
-        <w:numPr>
-          <w:ilvl w:val="0"/>
-          <w:numId w:val="17"/>
-        </w:numPr>
-      </w:pPr>
-      <w:r>
-        <w:t>Sistemas de Gestión de Cuentas por Pagar (AP) / Cobrar (AR).</w:t>
-      </w:r>
-    </w:p>
-    <w:p>
-      <w:pPr>
-        <w:pStyle w:val="Prrafodelista"/>
-        <w:numPr>
-          <w:ilvl w:val="0"/>
-          <w:numId w:val="17"/>
-        </w:numPr>
-      </w:pPr>
-      <w:r>
-        <w:t>Plataformas de Conciliación Bancaria Automática.</w:t>
-      </w:r>
-    </w:p>
-    <w:p>
-      <w:pPr>
-        <w:pStyle w:val="Prrafodelista"/>
-        <w:numPr>
-          <w:ilvl w:val="0"/>
-          <w:numId w:val="17"/>
-        </w:numPr>
-      </w:pPr>
-      <w:r>
-        <w:t xml:space="preserve">Herramientas de Automatización de Gastos: SAP </w:t>
-      </w:r>
-      <w:proofErr w:type="spellStart"/>
-      <w:r>
-        <w:t>Concur</w:t>
-      </w:r>
-      <w:proofErr w:type="spellEnd"/>
-      <w:r>
-        <w:t xml:space="preserve">, </w:t>
-      </w:r>
-      <w:proofErr w:type="spellStart"/>
-      <w:r>
-        <w:t>Expensify</w:t>
-      </w:r>
-      <w:proofErr w:type="spellEnd"/>
-      <w:r>
-        <w:t>.</w:t>
-      </w:r>
-    </w:p>
-    <w:p>
-      <w:pPr>
-        <w:pStyle w:val="Prrafodelista"/>
-        <w:numPr>
-          <w:ilvl w:val="0"/>
-          <w:numId w:val="17"/>
-        </w:numPr>
-      </w:pPr>
-      <w:r>
-        <w:t>Software de Tesorería y Gestión del Flujo de Caja.</w:t>
-      </w:r>
-    </w:p>
-    <w:p/>
-    <w:p>
-      <w:pPr>
-        <w:pStyle w:val="Ttulo4"/>
-        <w:rPr>
-          <w:b/>
-          <w:bCs/>
-        </w:rPr>
-      </w:pPr>
-      <w:r>
-        <w:t>Esquema Documentación Herramientas</w:t>
-      </w:r>
-    </w:p>
-    <w:p>
-      <w:r>
-        <w:t>Herramienta Clave:</w:t>
-      </w:r>
-    </w:p>
-    <w:p>
-      <w:pPr>
-        <w:pStyle w:val="Prrafodelista"/>
-        <w:numPr>
-          <w:ilvl w:val="0"/>
-          <w:numId w:val="17"/>
-        </w:numPr>
-      </w:pPr>
-      <w:r>
-        <w:t>Tipo de Documentación Imprescindible</w:t>
-      </w:r>
-      <w:r>
-        <w:tab/>
-      </w:r>
-    </w:p>
-    <w:p>
-      <w:pPr>
-        <w:pStyle w:val="Prrafodelista"/>
-        <w:numPr>
-          <w:ilvl w:val="0"/>
-          <w:numId w:val="17"/>
-        </w:numPr>
-      </w:pPr>
-      <w:r>
-        <w:t>Tipo de Documentación Necesaria (E2E/Automatización)</w:t>
-      </w:r>
-    </w:p>
-    <w:p>
-      <w:pPr>
-        <w:rPr>
-          <w:b/>
-          <w:bCs/>
-        </w:rPr>
-      </w:pPr>
-      <w:r>
-        <w:rPr>
-          <w:b/>
-          <w:bCs/>
-        </w:rPr>
-        <w:t>Software de Contabilidad (</w:t>
-      </w:r>
-      <w:proofErr w:type="spellStart"/>
-      <w:r>
-        <w:rPr>
-          <w:b/>
-          <w:bCs/>
-        </w:rPr>
-        <w:t>QuickBooks</w:t>
-      </w:r>
-      <w:proofErr w:type="spellEnd"/>
-      <w:r>
-        <w:rPr>
-          <w:b/>
-          <w:bCs/>
-        </w:rPr>
-        <w:t>, Sage)</w:t>
-      </w:r>
-    </w:p>
-    <w:p>
-      <w:pPr>
-        <w:pStyle w:val="Prrafodelista"/>
-        <w:numPr>
-          <w:ilvl w:val="0"/>
-          <w:numId w:val="17"/>
-        </w:numPr>
-      </w:pPr>
-      <w:r>
-        <w:t>Manuales de Registro de Asientos Contables y Cierre Fiscal.</w:t>
-      </w:r>
-      <w:r>
-        <w:tab/>
-      </w:r>
-    </w:p>
-    <w:p>
-      <w:pPr>
-        <w:pStyle w:val="Prrafodelista"/>
-        <w:numPr>
-          <w:ilvl w:val="0"/>
-          <w:numId w:val="17"/>
-        </w:numPr>
-      </w:pPr>
-      <w:r>
-        <w:t>Documentación de la API de Contabilidad para la inserción automática de facturas y asientos.</w:t>
-      </w:r>
-    </w:p>
-    <w:p>
-      <w:pPr>
-        <w:rPr>
-          <w:b/>
-          <w:bCs/>
-        </w:rPr>
-      </w:pPr>
-      <w:r>
-        <w:rPr>
-          <w:b/>
-          <w:bCs/>
-        </w:rPr>
-        <w:t>ERP/Módulos Financieros</w:t>
-      </w:r>
-      <w:r>
-        <w:rPr>
-          <w:b/>
-          <w:bCs/>
-        </w:rPr>
-        <w:tab/>
-      </w:r>
-    </w:p>
-    <w:p>
-      <w:pPr>
-        <w:pStyle w:val="Prrafodelista"/>
-        <w:numPr>
-          <w:ilvl w:val="0"/>
-          <w:numId w:val="17"/>
-        </w:numPr>
-      </w:pPr>
-      <w:r>
         <w:t>Guías de Proceso de Cuentas por Pagar (AP) y Cuentas por Cobrar (AR).</w:t>
       </w:r>
       <w:r>
@@ -8645,153 +9158,385 @@
         </w:rPr>
       </w:pPr>
       <w:r>
+        <w:t>Dolor por departamento.</w:t>
+      </w:r>
+    </w:p>
+    <w:p>
+      <w:pPr>
+        <w:rPr>
+          <w:b/>
+          <w:bCs/>
+        </w:rPr>
+      </w:pPr>
+      <w:r>
+        <w:rPr>
+          <w:b/>
+          <w:bCs/>
+        </w:rPr>
+        <w:t>Problema Principal (Impacto E2E)</w:t>
+      </w:r>
+    </w:p>
+    <w:p>
+      <w:pPr>
+        <w:pStyle w:val="Prrafodelista"/>
+        <w:numPr>
+          <w:ilvl w:val="0"/>
+          <w:numId w:val="17"/>
+        </w:numPr>
+      </w:pPr>
+      <w:r>
+        <w:rPr>
+          <w:b/>
+          <w:bCs/>
+        </w:rPr>
+        <w:t>Retrasos en el Flujo de Caja:</w:t>
+      </w:r>
+      <w:r>
+        <w:t xml:space="preserve"> Cobros tardíos a clientes o falta de visibilidad de los pagos pendientes.</w:t>
+      </w:r>
+    </w:p>
+    <w:p>
+      <w:pPr>
+        <w:pStyle w:val="Prrafodelista"/>
+        <w:numPr>
+          <w:ilvl w:val="0"/>
+          <w:numId w:val="17"/>
+        </w:numPr>
+      </w:pPr>
+      <w:r>
+        <w:rPr>
+          <w:b/>
+          <w:bCs/>
+        </w:rPr>
+        <w:t>Riesgo de Incumplimiento Fiscal:</w:t>
+      </w:r>
+      <w:r>
+        <w:t xml:space="preserve"> Errores humanos en el registro de facturas o cálculos tributarios.</w:t>
+      </w:r>
+    </w:p>
+    <w:p>
+      <w:pPr>
+        <w:pStyle w:val="Prrafodelista"/>
+        <w:numPr>
+          <w:ilvl w:val="0"/>
+          <w:numId w:val="17"/>
+        </w:numPr>
+      </w:pPr>
+      <w:r>
+        <w:rPr>
+          <w:b/>
+          <w:bCs/>
+        </w:rPr>
+        <w:t>Cierres Financieros Largos:</w:t>
+      </w:r>
+      <w:r>
+        <w:t xml:space="preserve"> El proceso de </w:t>
+      </w:r>
+      <w:proofErr w:type="spellStart"/>
+      <w:r>
+        <w:t>closing</w:t>
+      </w:r>
+      <w:proofErr w:type="spellEnd"/>
+      <w:r>
+        <w:t xml:space="preserve"> mensual/anual requiere mucha intervención manual y verificación.</w:t>
+      </w:r>
+    </w:p>
+    <w:p>
+      <w:pPr>
+        <w:rPr>
+          <w:b/>
+          <w:bCs/>
+        </w:rPr>
+      </w:pPr>
+      <w:r>
+        <w:rPr>
+          <w:b/>
+          <w:bCs/>
+        </w:rPr>
+        <w:t>Problemas Frecuentes (Candidatos a Automatización)</w:t>
+      </w:r>
+    </w:p>
+    <w:p>
+      <w:pPr>
+        <w:pStyle w:val="Prrafodelista"/>
+        <w:numPr>
+          <w:ilvl w:val="0"/>
+          <w:numId w:val="17"/>
+        </w:numPr>
+      </w:pPr>
+      <w:r>
+        <w:rPr>
+          <w:b/>
+          <w:bCs/>
+        </w:rPr>
+        <w:t>Conciliación Bancaria Manual:</w:t>
+      </w:r>
+      <w:r>
+        <w:t xml:space="preserve"> Cotejar transacciones bancarias con registros contables.</w:t>
+      </w:r>
+    </w:p>
+    <w:p>
+      <w:pPr>
+        <w:pStyle w:val="Prrafodelista"/>
+        <w:numPr>
+          <w:ilvl w:val="0"/>
+          <w:numId w:val="17"/>
+        </w:numPr>
+      </w:pPr>
+      <w:r>
+        <w:rPr>
+          <w:b/>
+          <w:bCs/>
+        </w:rPr>
+        <w:t>Procesamiento de Facturas de Proveedores (AP):</w:t>
+      </w:r>
+      <w:r>
+        <w:t xml:space="preserve"> Captura manual de datos y largas cadenas de aprobación de gastos.</w:t>
+      </w:r>
+    </w:p>
+    <w:p>
+      <w:pPr>
+        <w:pStyle w:val="Prrafodelista"/>
+        <w:numPr>
+          <w:ilvl w:val="0"/>
+          <w:numId w:val="17"/>
+        </w:numPr>
+      </w:pPr>
+      <w:r>
+        <w:t>Generación de Asientos Contables Repetitivos o basados en datos no unificados (ej. desde el CRM).</w:t>
+      </w:r>
+    </w:p>
+    <w:p/>
+    <w:p>
+      <w:pPr>
+        <w:pStyle w:val="Ttulo4"/>
+        <w:rPr>
+          <w:b/>
+          <w:bCs/>
+        </w:rPr>
+      </w:pPr>
+      <w:r>
+        <w:t>Cura por departamento.</w:t>
+      </w:r>
+    </w:p>
+    <w:p>
+      <w:r>
+        <w:t>Problema a Mitigar:</w:t>
+      </w:r>
+    </w:p>
+    <w:p>
+      <w:pPr>
+        <w:pStyle w:val="Prrafodelista"/>
+        <w:numPr>
+          <w:ilvl w:val="0"/>
+          <w:numId w:val="17"/>
+        </w:numPr>
+      </w:pPr>
+      <w:r>
+        <w:t>Solución de Automatización E2E</w:t>
+      </w:r>
+      <w:r>
+        <w:tab/>
+      </w:r>
+    </w:p>
+    <w:p>
+      <w:pPr>
+        <w:pStyle w:val="Prrafodelista"/>
+        <w:numPr>
+          <w:ilvl w:val="1"/>
+          <w:numId w:val="17"/>
+        </w:numPr>
+      </w:pPr>
+      <w:r>
         <w:lastRenderedPageBreak/>
-        <w:t>Dolor por departamento.</w:t>
-      </w:r>
-    </w:p>
-    <w:p>
-      <w:pPr>
-        <w:rPr>
-          <w:b/>
-          <w:bCs/>
-        </w:rPr>
-      </w:pPr>
-      <w:r>
-        <w:rPr>
-          <w:b/>
-          <w:bCs/>
-        </w:rPr>
-        <w:t>Problema Principal (Impacto E2E)</w:t>
-      </w:r>
-    </w:p>
-    <w:p>
-      <w:pPr>
-        <w:pStyle w:val="Prrafodelista"/>
-        <w:numPr>
-          <w:ilvl w:val="0"/>
-          <w:numId w:val="17"/>
-        </w:numPr>
-      </w:pPr>
-      <w:r>
-        <w:rPr>
-          <w:b/>
-          <w:bCs/>
-        </w:rPr>
-        <w:t>Retrasos en el Flujo de Caja:</w:t>
-      </w:r>
-      <w:r>
-        <w:t xml:space="preserve"> Cobros tardíos a clientes o falta de visibilidad de los pagos pendientes.</w:t>
-      </w:r>
-    </w:p>
-    <w:p>
-      <w:pPr>
-        <w:pStyle w:val="Prrafodelista"/>
-        <w:numPr>
-          <w:ilvl w:val="0"/>
-          <w:numId w:val="17"/>
-        </w:numPr>
-      </w:pPr>
-      <w:r>
-        <w:rPr>
-          <w:b/>
-          <w:bCs/>
-        </w:rPr>
-        <w:t>Riesgo de Incumplimiento Fiscal:</w:t>
-      </w:r>
-      <w:r>
-        <w:t xml:space="preserve"> Errores humanos en el registro de facturas o cálculos tributarios.</w:t>
-      </w:r>
-    </w:p>
-    <w:p>
-      <w:pPr>
-        <w:pStyle w:val="Prrafodelista"/>
-        <w:numPr>
-          <w:ilvl w:val="0"/>
-          <w:numId w:val="17"/>
-        </w:numPr>
-      </w:pPr>
-      <w:r>
-        <w:rPr>
-          <w:b/>
-          <w:bCs/>
-        </w:rPr>
-        <w:t>Cierres Financieros Largos:</w:t>
-      </w:r>
-      <w:r>
-        <w:t xml:space="preserve"> El proceso de </w:t>
-      </w:r>
-      <w:proofErr w:type="spellStart"/>
-      <w:r>
-        <w:t>closing</w:t>
-      </w:r>
-      <w:proofErr w:type="spellEnd"/>
-      <w:r>
-        <w:t xml:space="preserve"> mensual/anual requiere mucha intervención manual y verificación.</w:t>
-      </w:r>
-    </w:p>
-    <w:p>
-      <w:pPr>
-        <w:rPr>
-          <w:b/>
-          <w:bCs/>
-        </w:rPr>
-      </w:pPr>
-      <w:r>
-        <w:rPr>
-          <w:b/>
-          <w:bCs/>
-        </w:rPr>
-        <w:t>Problemas Frecuentes (Candidatos a Automatización)</w:t>
-      </w:r>
-    </w:p>
-    <w:p>
-      <w:pPr>
-        <w:pStyle w:val="Prrafodelista"/>
-        <w:numPr>
-          <w:ilvl w:val="0"/>
-          <w:numId w:val="17"/>
-        </w:numPr>
-      </w:pPr>
-      <w:r>
-        <w:rPr>
-          <w:b/>
-          <w:bCs/>
-        </w:rPr>
-        <w:t>Conciliación Bancaria Manual:</w:t>
-      </w:r>
-      <w:r>
-        <w:t xml:space="preserve"> Cotejar transacciones bancarias con registros contables.</w:t>
-      </w:r>
-    </w:p>
-    <w:p>
-      <w:pPr>
-        <w:pStyle w:val="Prrafodelista"/>
-        <w:numPr>
-          <w:ilvl w:val="0"/>
-          <w:numId w:val="17"/>
-        </w:numPr>
-      </w:pPr>
-      <w:r>
-        <w:rPr>
-          <w:b/>
-          <w:bCs/>
-        </w:rPr>
-        <w:t>Procesamiento de Facturas de Proveedores (AP):</w:t>
-      </w:r>
-      <w:r>
-        <w:t xml:space="preserve"> Captura manual de datos y largas cadenas de aprobación de gastos.</w:t>
-      </w:r>
-    </w:p>
-    <w:p>
-      <w:pPr>
-        <w:pStyle w:val="Prrafodelista"/>
-        <w:numPr>
-          <w:ilvl w:val="0"/>
-          <w:numId w:val="17"/>
-        </w:numPr>
-      </w:pPr>
-      <w:r>
-        <w:t>Generación de Asientos Contables Repetitivos o basados en datos no unificados (ej. desde el CRM).</w:t>
+        <w:t>Herramienta Clave</w:t>
+      </w:r>
+    </w:p>
+    <w:p>
+      <w:pPr>
+        <w:rPr>
+          <w:b/>
+          <w:bCs/>
+        </w:rPr>
+      </w:pPr>
+      <w:r>
+        <w:rPr>
+          <w:b/>
+          <w:bCs/>
+        </w:rPr>
+        <w:t>Conciliación Bancaria Manual</w:t>
+      </w:r>
+      <w:r>
+        <w:rPr>
+          <w:b/>
+          <w:bCs/>
+        </w:rPr>
+        <w:t>:</w:t>
+      </w:r>
+    </w:p>
+    <w:p>
+      <w:pPr>
+        <w:pStyle w:val="Prrafodelista"/>
+        <w:numPr>
+          <w:ilvl w:val="0"/>
+          <w:numId w:val="17"/>
+        </w:numPr>
+      </w:pPr>
+      <w:r>
+        <w:t xml:space="preserve">Procesamiento y </w:t>
+      </w:r>
+      <w:proofErr w:type="spellStart"/>
+      <w:r>
+        <w:t>Matching</w:t>
+      </w:r>
+      <w:proofErr w:type="spellEnd"/>
+      <w:r>
+        <w:t xml:space="preserve"> Automatizado. El </w:t>
+      </w:r>
+      <w:proofErr w:type="spellStart"/>
+      <w:r>
+        <w:t>workflow</w:t>
+      </w:r>
+      <w:proofErr w:type="spellEnd"/>
+      <w:r>
+        <w:t xml:space="preserve"> recibe extractos bancarios (vía API o archivos), lee las transacciones y las compara automáticamente con las facturas del sistema contable para el </w:t>
+      </w:r>
+      <w:proofErr w:type="spellStart"/>
+      <w:r>
+        <w:t>matching</w:t>
+      </w:r>
+      <w:proofErr w:type="spellEnd"/>
+      <w:r>
+        <w:t>.</w:t>
+      </w:r>
+      <w:r>
+        <w:tab/>
+      </w:r>
+    </w:p>
+    <w:p>
+      <w:pPr>
+        <w:pStyle w:val="Prrafodelista"/>
+        <w:numPr>
+          <w:ilvl w:val="1"/>
+          <w:numId w:val="17"/>
+        </w:numPr>
+      </w:pPr>
+      <w:r>
+        <w:t xml:space="preserve">n8n / make.com (Manejan </w:t>
+      </w:r>
+      <w:proofErr w:type="spellStart"/>
+      <w:r>
+        <w:t>APIs</w:t>
+      </w:r>
+      <w:proofErr w:type="spellEnd"/>
+      <w:r>
+        <w:t xml:space="preserve"> bancarias y lógica de comparación). VBA / </w:t>
+      </w:r>
+      <w:proofErr w:type="spellStart"/>
+      <w:r>
+        <w:t>AppScript</w:t>
+      </w:r>
+      <w:proofErr w:type="spellEnd"/>
+      <w:r>
+        <w:t xml:space="preserve"> (Para automatizar la lectura de archivos de extracto locales o en la nube).</w:t>
+      </w:r>
+    </w:p>
+    <w:p>
+      <w:pPr>
+        <w:rPr>
+          <w:b/>
+          <w:bCs/>
+        </w:rPr>
+      </w:pPr>
+      <w:r>
+        <w:rPr>
+          <w:b/>
+          <w:bCs/>
+        </w:rPr>
+        <w:t>Procesamiento de Facturas (AP)</w:t>
+      </w:r>
+      <w:r>
+        <w:rPr>
+          <w:b/>
+          <w:bCs/>
+        </w:rPr>
+        <w:t>:</w:t>
+      </w:r>
+    </w:p>
+    <w:p>
+      <w:pPr>
+        <w:pStyle w:val="Prrafodelista"/>
+        <w:numPr>
+          <w:ilvl w:val="0"/>
+          <w:numId w:val="17"/>
+        </w:numPr>
+      </w:pPr>
+      <w:r>
+        <w:t>Captura OCR y Flujos de Aprobación. Un flujo captura la factura (email/escáner), utiliza OCR para extraer datos (monto, proveedor, IVA) y, si el monto es bajo, lo aprueba automáticamente o lo enruta al gerente adecuado.</w:t>
+      </w:r>
+      <w:r>
+        <w:tab/>
+      </w:r>
+    </w:p>
+    <w:p>
+      <w:pPr>
+        <w:pStyle w:val="Prrafodelista"/>
+        <w:numPr>
+          <w:ilvl w:val="1"/>
+          <w:numId w:val="17"/>
+        </w:numPr>
+      </w:pPr>
+      <w:r>
+        <w:t>n8n / make.com (Integran servicios de OCR con el sistema de aprobación).</w:t>
+      </w:r>
+    </w:p>
+    <w:p>
+      <w:pPr>
+        <w:rPr>
+          <w:b/>
+          <w:bCs/>
+        </w:rPr>
+      </w:pPr>
+      <w:r>
+        <w:rPr>
+          <w:b/>
+          <w:bCs/>
+        </w:rPr>
+        <w:t>Retrasos en el Flujo de Caja</w:t>
+      </w:r>
+      <w:r>
+        <w:rPr>
+          <w:b/>
+          <w:bCs/>
+        </w:rPr>
+        <w:tab/>
+      </w:r>
+    </w:p>
+    <w:p>
+      <w:pPr>
+        <w:pStyle w:val="Prrafodelista"/>
+        <w:numPr>
+          <w:ilvl w:val="0"/>
+          <w:numId w:val="17"/>
+        </w:numPr>
+      </w:pPr>
+      <w:r>
+        <w:t>Recordatorios de Pago Inteligentes. Flujos que monitorizan cuentas por cobrar. Si una factura pasa de 15 días, el sistema envía un recordatorio; a los 30 días, notifica al CFO.</w:t>
+      </w:r>
+      <w:r>
+        <w:tab/>
+      </w:r>
+    </w:p>
+    <w:p>
+      <w:pPr>
+        <w:pStyle w:val="Prrafodelista"/>
+        <w:numPr>
+          <w:ilvl w:val="1"/>
+          <w:numId w:val="17"/>
+        </w:numPr>
+      </w:pPr>
+      <w:r>
+        <w:t>n8n / make.com (Conectan el sistema de facturación con emails escalonados).</w:t>
       </w:r>
     </w:p>
     <w:p/>
@@ -8804,12 +9549,221 @@
         </w:rPr>
       </w:pPr>
       <w:r>
-        <w:t>Cura por departamento.</w:t>
-      </w:r>
-    </w:p>
-    <w:p>
-      <w:r>
-        <w:t>Problema a Mitigar:</w:t>
+        <w:t xml:space="preserve">Dolor </w:t>
+      </w:r>
+      <w:proofErr w:type="spellStart"/>
+      <w:r>
+        <w:t>IntraDepartamental</w:t>
+      </w:r>
+      <w:proofErr w:type="spellEnd"/>
+    </w:p>
+    <w:p>
+      <w:r>
+        <w:t>Posición Clave</w:t>
+      </w:r>
+    </w:p>
+    <w:p>
+      <w:pPr>
+        <w:pStyle w:val="Prrafodelista"/>
+        <w:numPr>
+          <w:ilvl w:val="0"/>
+          <w:numId w:val="17"/>
+        </w:numPr>
+      </w:pPr>
+      <w:r>
+        <w:t>Problema Interno Principal</w:t>
+      </w:r>
+      <w:r>
+        <w:tab/>
+      </w:r>
+    </w:p>
+    <w:p>
+      <w:pPr>
+        <w:pStyle w:val="Prrafodelista"/>
+        <w:numPr>
+          <w:ilvl w:val="0"/>
+          <w:numId w:val="17"/>
+        </w:numPr>
+      </w:pPr>
+      <w:r>
+        <w:t>Por qué Ocurre (Candidato a Automatización)</w:t>
+      </w:r>
+    </w:p>
+    <w:p>
+      <w:pPr>
+        <w:rPr>
+          <w:b/>
+          <w:bCs/>
+        </w:rPr>
+      </w:pPr>
+      <w:r>
+        <w:rPr>
+          <w:b/>
+          <w:bCs/>
+        </w:rPr>
+        <w:t>Contable General:</w:t>
+      </w:r>
+      <w:r>
+        <w:rPr>
+          <w:b/>
+          <w:bCs/>
+        </w:rPr>
+        <w:tab/>
+      </w:r>
+    </w:p>
+    <w:p>
+      <w:pPr>
+        <w:pStyle w:val="Prrafodelista"/>
+        <w:numPr>
+          <w:ilvl w:val="0"/>
+          <w:numId w:val="17"/>
+        </w:numPr>
+      </w:pPr>
+      <w:r>
+        <w:t>Alto volumen de entrada manual de datos de facturas. (Introducir detalles de proveedores, montos, IVA en el sistema contable).</w:t>
+      </w:r>
+      <w:r>
+        <w:tab/>
+      </w:r>
+    </w:p>
+    <w:p>
+      <w:pPr>
+        <w:pStyle w:val="Prrafodelista"/>
+        <w:numPr>
+          <w:ilvl w:val="0"/>
+          <w:numId w:val="17"/>
+        </w:numPr>
+      </w:pPr>
+      <w:r>
+        <w:t>Falta de herramientas de OCR o de integración directa con sistemas de facturación digital.</w:t>
+      </w:r>
+    </w:p>
+    <w:p>
+      <w:pPr>
+        <w:rPr>
+          <w:b/>
+          <w:bCs/>
+        </w:rPr>
+      </w:pPr>
+      <w:proofErr w:type="spellStart"/>
+      <w:r>
+        <w:rPr>
+          <w:b/>
+          <w:bCs/>
+        </w:rPr>
+        <w:t>Controller</w:t>
+      </w:r>
+      <w:proofErr w:type="spellEnd"/>
+      <w:r>
+        <w:rPr>
+          <w:b/>
+          <w:bCs/>
+        </w:rPr>
+        <w:t xml:space="preserve"> Financiero:</w:t>
+      </w:r>
+    </w:p>
+    <w:p>
+      <w:pPr>
+        <w:pStyle w:val="Prrafodelista"/>
+        <w:numPr>
+          <w:ilvl w:val="0"/>
+          <w:numId w:val="17"/>
+        </w:numPr>
+      </w:pPr>
+      <w:r>
+        <w:t xml:space="preserve">Demora en el </w:t>
+      </w:r>
+      <w:proofErr w:type="spellStart"/>
+      <w:r>
+        <w:t>Reporting</w:t>
+      </w:r>
+      <w:proofErr w:type="spellEnd"/>
+      <w:r>
+        <w:t xml:space="preserve"> y Cierre Mensual/Anual. (El análisis de costes llega tarde para la toma de decisiones).</w:t>
+      </w:r>
+      <w:r>
+        <w:tab/>
+      </w:r>
+    </w:p>
+    <w:p>
+      <w:pPr>
+        <w:pStyle w:val="Prrafodelista"/>
+        <w:numPr>
+          <w:ilvl w:val="0"/>
+          <w:numId w:val="17"/>
+        </w:numPr>
+      </w:pPr>
+      <w:r>
+        <w:lastRenderedPageBreak/>
+        <w:t>La consolidación de datos de diferentes fuentes (ERP, Excel, bancos) se hace manualmente.</w:t>
+      </w:r>
+    </w:p>
+    <w:p>
+      <w:pPr>
+        <w:rPr>
+          <w:b/>
+          <w:bCs/>
+        </w:rPr>
+      </w:pPr>
+      <w:r>
+        <w:rPr>
+          <w:b/>
+          <w:bCs/>
+        </w:rPr>
+        <w:t>Director Financiero (CFO):</w:t>
+      </w:r>
+    </w:p>
+    <w:p>
+      <w:pPr>
+        <w:pStyle w:val="Prrafodelista"/>
+        <w:numPr>
+          <w:ilvl w:val="0"/>
+          <w:numId w:val="17"/>
+        </w:numPr>
+      </w:pPr>
+      <w:r>
+        <w:t>Riesgo de fraude o errores por falta de control interno. (Pagos no autorizados o duplicados).</w:t>
+      </w:r>
+      <w:r>
+        <w:tab/>
+      </w:r>
+    </w:p>
+    <w:p>
+      <w:pPr>
+        <w:pStyle w:val="Prrafodelista"/>
+        <w:numPr>
+          <w:ilvl w:val="0"/>
+          <w:numId w:val="17"/>
+        </w:numPr>
+      </w:pPr>
+      <w:r>
+        <w:t>Cadenas de aprobación laxas o manuales sin verificación automática de duplicados.</w:t>
+      </w:r>
+    </w:p>
+    <w:p/>
+    <w:p>
+      <w:pPr>
+        <w:pStyle w:val="Ttulo4"/>
+        <w:rPr>
+          <w:b/>
+          <w:bCs/>
+        </w:rPr>
+      </w:pPr>
+      <w:r>
+        <w:t xml:space="preserve">Curas </w:t>
+      </w:r>
+      <w:proofErr w:type="spellStart"/>
+      <w:r>
+        <w:t>IntraDepartamentales</w:t>
+      </w:r>
+      <w:proofErr w:type="spellEnd"/>
+      <w:r>
+        <w:t>.</w:t>
+      </w:r>
+    </w:p>
+    <w:p>
+      <w:r>
+        <w:t>Problema Interno:</w:t>
       </w:r>
     </w:p>
     <w:p>
@@ -8823,9 +9777,6 @@
       <w:r>
         <w:t>Solución de Automatización E2E</w:t>
       </w:r>
-      <w:r>
-        <w:tab/>
-      </w:r>
     </w:p>
     <w:p>
       <w:pPr>
@@ -8851,34 +9802,27 @@
           <w:b/>
           <w:bCs/>
         </w:rPr>
-        <w:t>Conciliación Bancaria Manual</w:t>
-      </w:r>
-      <w:r>
-        <w:rPr>
-          <w:b/>
-          <w:bCs/>
-        </w:rPr>
-        <w:t>:</w:t>
-      </w:r>
-    </w:p>
-    <w:p>
-      <w:pPr>
-        <w:pStyle w:val="Prrafodelista"/>
-        <w:numPr>
-          <w:ilvl w:val="0"/>
-          <w:numId w:val="17"/>
-        </w:numPr>
-      </w:pPr>
-      <w:r>
-        <w:t xml:space="preserve">Procesamiento y </w:t>
-      </w:r>
-      <w:proofErr w:type="spellStart"/>
-      <w:r>
-        <w:t>Matching</w:t>
-      </w:r>
-      <w:proofErr w:type="spellEnd"/>
-      <w:r>
-        <w:t xml:space="preserve"> Automatizado. El </w:t>
+        <w:t>Alto volumen de entrada manual de datos de facturas:</w:t>
+      </w:r>
+    </w:p>
+    <w:p>
+      <w:pPr>
+        <w:pStyle w:val="Prrafodelista"/>
+        <w:numPr>
+          <w:ilvl w:val="0"/>
+          <w:numId w:val="17"/>
+        </w:numPr>
+      </w:pPr>
+      <w:r>
+        <w:t xml:space="preserve">Captura OCR y Data </w:t>
+      </w:r>
+      <w:proofErr w:type="spellStart"/>
+      <w:r>
+        <w:t>Entry</w:t>
+      </w:r>
+      <w:proofErr w:type="spellEnd"/>
+      <w:r>
+        <w:t xml:space="preserve"> Automatizada: Un </w:t>
       </w:r>
       <w:proofErr w:type="spellStart"/>
       <w:r>
@@ -8886,442 +9830,7 @@
       </w:r>
       <w:proofErr w:type="spellEnd"/>
       <w:r>
-        <w:t xml:space="preserve"> recibe extractos bancarios (vía API o archivos), lee las transacciones y las compara automáticamente con las facturas del sistema contable para el </w:t>
-      </w:r>
-      <w:proofErr w:type="spellStart"/>
-      <w:r>
-        <w:t>matching</w:t>
-      </w:r>
-      <w:proofErr w:type="spellEnd"/>
-      <w:r>
-        <w:t>.</w:t>
-      </w:r>
-      <w:r>
-        <w:tab/>
-      </w:r>
-    </w:p>
-    <w:p>
-      <w:pPr>
-        <w:pStyle w:val="Prrafodelista"/>
-        <w:numPr>
-          <w:ilvl w:val="1"/>
-          <w:numId w:val="17"/>
-        </w:numPr>
-      </w:pPr>
-      <w:r>
-        <w:t xml:space="preserve">n8n / make.com (Manejan </w:t>
-      </w:r>
-      <w:proofErr w:type="spellStart"/>
-      <w:r>
-        <w:t>APIs</w:t>
-      </w:r>
-      <w:proofErr w:type="spellEnd"/>
-      <w:r>
-        <w:t xml:space="preserve"> bancarias y lógica de comparación). VBA / </w:t>
-      </w:r>
-      <w:proofErr w:type="spellStart"/>
-      <w:r>
-        <w:t>AppScript</w:t>
-      </w:r>
-      <w:proofErr w:type="spellEnd"/>
-      <w:r>
-        <w:t xml:space="preserve"> (Para automatizar la lectura de archivos de extracto locales o en la nube).</w:t>
-      </w:r>
-    </w:p>
-    <w:p>
-      <w:pPr>
-        <w:rPr>
-          <w:b/>
-          <w:bCs/>
-        </w:rPr>
-      </w:pPr>
-      <w:r>
-        <w:rPr>
-          <w:b/>
-          <w:bCs/>
-        </w:rPr>
-        <w:t>Procesamiento de Facturas (AP)</w:t>
-      </w:r>
-      <w:r>
-        <w:rPr>
-          <w:b/>
-          <w:bCs/>
-        </w:rPr>
-        <w:t>:</w:t>
-      </w:r>
-    </w:p>
-    <w:p>
-      <w:pPr>
-        <w:pStyle w:val="Prrafodelista"/>
-        <w:numPr>
-          <w:ilvl w:val="0"/>
-          <w:numId w:val="17"/>
-        </w:numPr>
-      </w:pPr>
-      <w:r>
-        <w:t>Captura OCR y Flujos de Aprobación. Un flujo captura la factura (email/escáner), utiliza OCR para extraer datos (monto, proveedor, IVA) y, si el monto es bajo, lo aprueba automáticamente o lo enruta al gerente adecuado.</w:t>
-      </w:r>
-      <w:r>
-        <w:tab/>
-      </w:r>
-    </w:p>
-    <w:p>
-      <w:pPr>
-        <w:pStyle w:val="Prrafodelista"/>
-        <w:numPr>
-          <w:ilvl w:val="1"/>
-          <w:numId w:val="17"/>
-        </w:numPr>
-      </w:pPr>
-      <w:r>
-        <w:t>n8n / make.com (Integran servicios de OCR con el sistema de aprobación).</w:t>
-      </w:r>
-    </w:p>
-    <w:p>
-      <w:pPr>
-        <w:rPr>
-          <w:b/>
-          <w:bCs/>
-        </w:rPr>
-      </w:pPr>
-      <w:r>
-        <w:rPr>
-          <w:b/>
-          <w:bCs/>
-        </w:rPr>
-        <w:t>Retrasos en el Flujo de Caja</w:t>
-      </w:r>
-      <w:r>
-        <w:rPr>
-          <w:b/>
-          <w:bCs/>
-        </w:rPr>
-        <w:tab/>
-      </w:r>
-    </w:p>
-    <w:p>
-      <w:pPr>
-        <w:pStyle w:val="Prrafodelista"/>
-        <w:numPr>
-          <w:ilvl w:val="0"/>
-          <w:numId w:val="17"/>
-        </w:numPr>
-      </w:pPr>
-      <w:r>
-        <w:lastRenderedPageBreak/>
-        <w:t>Recordatorios de Pago Inteligentes. Flujos que monitorizan cuentas por cobrar. Si una factura pasa de 15 días, el sistema envía un recordatorio; a los 30 días, notifica al CFO.</w:t>
-      </w:r>
-      <w:r>
-        <w:tab/>
-      </w:r>
-    </w:p>
-    <w:p>
-      <w:pPr>
-        <w:pStyle w:val="Prrafodelista"/>
-        <w:numPr>
-          <w:ilvl w:val="1"/>
-          <w:numId w:val="17"/>
-        </w:numPr>
-      </w:pPr>
-      <w:r>
-        <w:t>n8n / make.com (Conectan el sistema de facturación con emails escalonados).</w:t>
-      </w:r>
-    </w:p>
-    <w:p/>
-    <w:p>
-      <w:pPr>
-        <w:pStyle w:val="Ttulo4"/>
-        <w:rPr>
-          <w:b/>
-          <w:bCs/>
-        </w:rPr>
-      </w:pPr>
-      <w:r>
-        <w:t xml:space="preserve">Dolor </w:t>
-      </w:r>
-      <w:proofErr w:type="spellStart"/>
-      <w:r>
-        <w:t>IntraDepartamental</w:t>
-      </w:r>
-      <w:proofErr w:type="spellEnd"/>
-    </w:p>
-    <w:p>
-      <w:r>
-        <w:t>Posición Clave</w:t>
-      </w:r>
-    </w:p>
-    <w:p>
-      <w:pPr>
-        <w:pStyle w:val="Prrafodelista"/>
-        <w:numPr>
-          <w:ilvl w:val="0"/>
-          <w:numId w:val="17"/>
-        </w:numPr>
-      </w:pPr>
-      <w:r>
-        <w:t>Problema Interno Principal</w:t>
-      </w:r>
-      <w:r>
-        <w:tab/>
-      </w:r>
-    </w:p>
-    <w:p>
-      <w:pPr>
-        <w:pStyle w:val="Prrafodelista"/>
-        <w:numPr>
-          <w:ilvl w:val="0"/>
-          <w:numId w:val="17"/>
-        </w:numPr>
-      </w:pPr>
-      <w:r>
-        <w:t>Por qué Ocurre (Candidato a Automatización)</w:t>
-      </w:r>
-    </w:p>
-    <w:p>
-      <w:pPr>
-        <w:rPr>
-          <w:b/>
-          <w:bCs/>
-        </w:rPr>
-      </w:pPr>
-      <w:r>
-        <w:rPr>
-          <w:b/>
-          <w:bCs/>
-        </w:rPr>
-        <w:t>Contable General:</w:t>
-      </w:r>
-      <w:r>
-        <w:rPr>
-          <w:b/>
-          <w:bCs/>
-        </w:rPr>
-        <w:tab/>
-      </w:r>
-    </w:p>
-    <w:p>
-      <w:pPr>
-        <w:pStyle w:val="Prrafodelista"/>
-        <w:numPr>
-          <w:ilvl w:val="0"/>
-          <w:numId w:val="17"/>
-        </w:numPr>
-      </w:pPr>
-      <w:r>
-        <w:t>Alto volumen de entrada manual de datos de facturas. (Introducir detalles de proveedores, montos, IVA en el sistema contable).</w:t>
-      </w:r>
-      <w:r>
-        <w:tab/>
-      </w:r>
-    </w:p>
-    <w:p>
-      <w:pPr>
-        <w:pStyle w:val="Prrafodelista"/>
-        <w:numPr>
-          <w:ilvl w:val="0"/>
-          <w:numId w:val="17"/>
-        </w:numPr>
-      </w:pPr>
-      <w:r>
-        <w:t>Falta de herramientas de OCR o de integración directa con sistemas de facturación digital.</w:t>
-      </w:r>
-    </w:p>
-    <w:p>
-      <w:pPr>
-        <w:rPr>
-          <w:b/>
-          <w:bCs/>
-        </w:rPr>
-      </w:pPr>
-      <w:proofErr w:type="spellStart"/>
-      <w:r>
-        <w:rPr>
-          <w:b/>
-          <w:bCs/>
-        </w:rPr>
-        <w:t>Controller</w:t>
-      </w:r>
-      <w:proofErr w:type="spellEnd"/>
-      <w:r>
-        <w:rPr>
-          <w:b/>
-          <w:bCs/>
-        </w:rPr>
-        <w:t xml:space="preserve"> Financiero:</w:t>
-      </w:r>
-    </w:p>
-    <w:p>
-      <w:pPr>
-        <w:pStyle w:val="Prrafodelista"/>
-        <w:numPr>
-          <w:ilvl w:val="0"/>
-          <w:numId w:val="17"/>
-        </w:numPr>
-      </w:pPr>
-      <w:r>
-        <w:t xml:space="preserve">Demora en el </w:t>
-      </w:r>
-      <w:proofErr w:type="spellStart"/>
-      <w:r>
-        <w:t>Reporting</w:t>
-      </w:r>
-      <w:proofErr w:type="spellEnd"/>
-      <w:r>
-        <w:t xml:space="preserve"> y Cierre Mensual/Anual. (El análisis de costes llega tarde para la toma de decisiones).</w:t>
-      </w:r>
-      <w:r>
-        <w:tab/>
-      </w:r>
-    </w:p>
-    <w:p>
-      <w:pPr>
-        <w:pStyle w:val="Prrafodelista"/>
-        <w:numPr>
-          <w:ilvl w:val="0"/>
-          <w:numId w:val="17"/>
-        </w:numPr>
-      </w:pPr>
-      <w:r>
-        <w:t>La consolidación de datos de diferentes fuentes (ERP, Excel, bancos) se hace manualmente.</w:t>
-      </w:r>
-    </w:p>
-    <w:p>
-      <w:pPr>
-        <w:rPr>
-          <w:b/>
-          <w:bCs/>
-        </w:rPr>
-      </w:pPr>
-      <w:r>
-        <w:rPr>
-          <w:b/>
-          <w:bCs/>
-        </w:rPr>
-        <w:t>Director Financiero (CFO):</w:t>
-      </w:r>
-    </w:p>
-    <w:p>
-      <w:pPr>
-        <w:pStyle w:val="Prrafodelista"/>
-        <w:numPr>
-          <w:ilvl w:val="0"/>
-          <w:numId w:val="17"/>
-        </w:numPr>
-      </w:pPr>
-      <w:r>
-        <w:t>Riesgo de fraude o errores por falta de control interno. (Pagos no autorizados o duplicados).</w:t>
-      </w:r>
-      <w:r>
-        <w:tab/>
-      </w:r>
-    </w:p>
-    <w:p>
-      <w:pPr>
-        <w:pStyle w:val="Prrafodelista"/>
-        <w:numPr>
-          <w:ilvl w:val="0"/>
-          <w:numId w:val="17"/>
-        </w:numPr>
-      </w:pPr>
-      <w:r>
-        <w:t>Cadenas de aprobación laxas o manuales sin verificación automática de duplicados.</w:t>
-      </w:r>
-    </w:p>
-    <w:p/>
-    <w:p>
-      <w:pPr>
-        <w:pStyle w:val="Ttulo4"/>
-        <w:rPr>
-          <w:b/>
-          <w:bCs/>
-        </w:rPr>
-      </w:pPr>
-      <w:r>
-        <w:t xml:space="preserve">Curas </w:t>
-      </w:r>
-      <w:proofErr w:type="spellStart"/>
-      <w:r>
-        <w:t>IntraDepartamentales</w:t>
-      </w:r>
-      <w:proofErr w:type="spellEnd"/>
-      <w:r>
-        <w:t>.</w:t>
-      </w:r>
-    </w:p>
-    <w:p>
-      <w:r>
-        <w:t>Problema Interno:</w:t>
-      </w:r>
-    </w:p>
-    <w:p>
-      <w:pPr>
-        <w:pStyle w:val="Prrafodelista"/>
-        <w:numPr>
-          <w:ilvl w:val="0"/>
-          <w:numId w:val="17"/>
-        </w:numPr>
-      </w:pPr>
-      <w:r>
-        <w:t>Solución de Automatización E2E</w:t>
-      </w:r>
-    </w:p>
-    <w:p>
-      <w:pPr>
-        <w:pStyle w:val="Prrafodelista"/>
-        <w:numPr>
-          <w:ilvl w:val="1"/>
-          <w:numId w:val="17"/>
-        </w:numPr>
-      </w:pPr>
-      <w:r>
-        <w:t>Herramienta Clave</w:t>
-      </w:r>
-    </w:p>
-    <w:p>
-      <w:pPr>
-        <w:rPr>
-          <w:b/>
-          <w:bCs/>
-        </w:rPr>
-      </w:pPr>
-      <w:r>
-        <w:rPr>
-          <w:b/>
-          <w:bCs/>
-        </w:rPr>
-        <w:t>Alto volumen de entrada manual de datos de facturas:</w:t>
-      </w:r>
-    </w:p>
-    <w:p>
-      <w:pPr>
-        <w:pStyle w:val="Prrafodelista"/>
-        <w:numPr>
-          <w:ilvl w:val="0"/>
-          <w:numId w:val="17"/>
-        </w:numPr>
-      </w:pPr>
-      <w:r>
-        <w:t xml:space="preserve">Captura OCR y Data </w:t>
-      </w:r>
-      <w:proofErr w:type="spellStart"/>
-      <w:r>
-        <w:t>Entry</w:t>
-      </w:r>
-      <w:proofErr w:type="spellEnd"/>
-      <w:r>
-        <w:t xml:space="preserve"> Automatizada: Un </w:t>
-      </w:r>
-      <w:proofErr w:type="spellStart"/>
-      <w:r>
-        <w:t>workflow</w:t>
-      </w:r>
-      <w:proofErr w:type="spellEnd"/>
-      <w:r>
-        <w:t xml:space="preserve"> lee un buzón de entrada, usa servicios de OCR (integrados por n8n/make.com) para extraer </w:t>
-      </w:r>
-      <w:r>
-        <w:lastRenderedPageBreak/>
-        <w:t>datos de la factura, y los inserta directamente en el software contable (validando que no sea duplicada).</w:t>
+        <w:t xml:space="preserve"> lee un buzón de entrada, usa servicios de OCR (integrados por n8n/make.com) para extraer datos de la factura, y los inserta directamente en el software contable (validando que no sea duplicada).</w:t>
       </w:r>
     </w:p>
     <w:p>

</xml_diff>